<commit_message>
feat: add DOCX generators for Certification and MSWDO Transmittal
- Implemented `certificationDocxGenerator.ts` to generate certification documents using a template.
- Implemented `mswdoTransmittalDocxGenerator.ts` to generate MSWDO transmittal documents using a template.
- Both generators utilize docxtemplater and pizzip for document manipulation and support downloading the generated files.
</commit_message>
<xml_diff>
--- a/public/docs/BLANK-FORM-CERTIFICATE-OF-TRANSFER.docx
+++ b/public/docs/BLANK-FORM-CERTIFICATE-OF-TRANSFER.docx
@@ -1278,6 +1278,7 @@
     </w:p>
     <w:p/>
     <w:sectPr>
+      <w:headerReference w:type="default" r:id="rId8"/>
       <w:pgSz w:w="12240" w:h="15840" w:code="1"/>
       <w:pgMar w:top="1440" w:right="1440" w:bottom="1440" w:left="1440" w:header="708" w:footer="708" w:gutter="0"/>
       <w:cols w:space="708"/>
@@ -1285,6 +1286,265 @@
     </w:sectPr>
   </w:body>
 </w:document>
+</file>
+
+<file path=word/endnotes.xml><?xml version="1.0" encoding="utf-8"?>
+<w:endnotes xmlns:wpc="http://schemas.microsoft.com/office/word/2010/wordprocessingCanvas" xmlns:cx="http://schemas.microsoft.com/office/drawing/2014/chartex" xmlns:cx1="http://schemas.microsoft.com/office/drawing/2015/9/8/chartex" xmlns:cx2="http://schemas.microsoft.com/office/drawing/2015/10/21/chartex" xmlns:cx3="http://schemas.microsoft.com/office/drawing/2016/5/9/chartex" xmlns:cx4="http://schemas.microsoft.com/office/drawing/2016/5/10/chartex" xmlns:cx5="http://schemas.microsoft.com/office/drawing/2016/5/11/chartex" xmlns:cx6="http://schemas.microsoft.com/office/drawing/2016/5/12/chartex" xmlns:cx7="http://schemas.microsoft.com/office/drawing/2016/5/13/chartex" xmlns:cx8="http://schemas.microsoft.com/office/drawing/2016/5/14/chartex" xmlns:mc="http://schemas.openxmlformats.org/markup-compatibility/2006" xmlns:aink="http://schemas.microsoft.com/office/drawing/2016/ink" xmlns:am3d="http://schemas.microsoft.com/office/drawing/2017/model3d" xmlns:o="urn:schemas-microsoft-com:office:office" xmlns:r="http://schemas.openxmlformats.org/officeDocument/2006/relationships" xmlns:m="http://schemas.openxmlformats.org/officeDocument/2006/math" xmlns:v="urn:schemas-microsoft-com:vml" xmlns:wp14="http://schemas.microsoft.com/office/word/2010/wordprocessingDrawing" xmlns:wp="http://schemas.openxmlformats.org/drawingml/2006/wordprocessingDrawing" xmlns:w10="urn:schemas-microsoft-com:office:word" xmlns:w="http://schemas.openxmlformats.org/wordprocessingml/2006/main" xmlns:w14="http://schemas.microsoft.com/office/word/2010/wordml" xmlns:w15="http://schemas.microsoft.com/office/word/2012/wordml" xmlns:w16cid="http://schemas.microsoft.com/office/word/2016/wordml/cid" xmlns:w16se="http://schemas.microsoft.com/office/word/2015/wordml/symex" xmlns:wpg="http://schemas.microsoft.com/office/word/2010/wordprocessingGroup" xmlns:wpi="http://schemas.microsoft.com/office/word/2010/wordprocessingInk" xmlns:wne="http://schemas.microsoft.com/office/word/2006/wordml" xmlns:wps="http://schemas.microsoft.com/office/word/2010/wordprocessingShape" mc:Ignorable="w14 w15 w16se w16cid wp14">
+  <w:endnote w:type="separator" w:id="-1">
+    <w:p>
+      <w:pPr>
+        <w:spacing w:after="0" w:line="240" w:lineRule="auto"/>
+      </w:pPr>
+      <w:r>
+        <w:separator/>
+      </w:r>
+    </w:p>
+  </w:endnote>
+  <w:endnote w:type="continuationSeparator" w:id="0">
+    <w:p>
+      <w:pPr>
+        <w:spacing w:after="0" w:line="240" w:lineRule="auto"/>
+      </w:pPr>
+      <w:r>
+        <w:continuationSeparator/>
+      </w:r>
+    </w:p>
+  </w:endnote>
+</w:endnotes>
+</file>
+
+<file path=word/footnotes.xml><?xml version="1.0" encoding="utf-8"?>
+<w:footnotes xmlns:wpc="http://schemas.microsoft.com/office/word/2010/wordprocessingCanvas" xmlns:cx="http://schemas.microsoft.com/office/drawing/2014/chartex" xmlns:cx1="http://schemas.microsoft.com/office/drawing/2015/9/8/chartex" xmlns:cx2="http://schemas.microsoft.com/office/drawing/2015/10/21/chartex" xmlns:cx3="http://schemas.microsoft.com/office/drawing/2016/5/9/chartex" xmlns:cx4="http://schemas.microsoft.com/office/drawing/2016/5/10/chartex" xmlns:cx5="http://schemas.microsoft.com/office/drawing/2016/5/11/chartex" xmlns:cx6="http://schemas.microsoft.com/office/drawing/2016/5/12/chartex" xmlns:cx7="http://schemas.microsoft.com/office/drawing/2016/5/13/chartex" xmlns:cx8="http://schemas.microsoft.com/office/drawing/2016/5/14/chartex" xmlns:mc="http://schemas.openxmlformats.org/markup-compatibility/2006" xmlns:aink="http://schemas.microsoft.com/office/drawing/2016/ink" xmlns:am3d="http://schemas.microsoft.com/office/drawing/2017/model3d" xmlns:o="urn:schemas-microsoft-com:office:office" xmlns:r="http://schemas.openxmlformats.org/officeDocument/2006/relationships" xmlns:m="http://schemas.openxmlformats.org/officeDocument/2006/math" xmlns:v="urn:schemas-microsoft-com:vml" xmlns:wp14="http://schemas.microsoft.com/office/word/2010/wordprocessingDrawing" xmlns:wp="http://schemas.openxmlformats.org/drawingml/2006/wordprocessingDrawing" xmlns:w10="urn:schemas-microsoft-com:office:word" xmlns:w="http://schemas.openxmlformats.org/wordprocessingml/2006/main" xmlns:w14="http://schemas.microsoft.com/office/word/2010/wordml" xmlns:w15="http://schemas.microsoft.com/office/word/2012/wordml" xmlns:w16cid="http://schemas.microsoft.com/office/word/2016/wordml/cid" xmlns:w16se="http://schemas.microsoft.com/office/word/2015/wordml/symex" xmlns:wpg="http://schemas.microsoft.com/office/word/2010/wordprocessingGroup" xmlns:wpi="http://schemas.microsoft.com/office/word/2010/wordprocessingInk" xmlns:wne="http://schemas.microsoft.com/office/word/2006/wordml" xmlns:wps="http://schemas.microsoft.com/office/word/2010/wordprocessingShape" mc:Ignorable="w14 w15 w16se w16cid wp14">
+  <w:footnote w:type="separator" w:id="-1">
+    <w:p>
+      <w:pPr>
+        <w:spacing w:after="0" w:line="240" w:lineRule="auto"/>
+      </w:pPr>
+      <w:r>
+        <w:separator/>
+      </w:r>
+    </w:p>
+  </w:footnote>
+  <w:footnote w:type="continuationSeparator" w:id="0">
+    <w:p>
+      <w:pPr>
+        <w:spacing w:after="0" w:line="240" w:lineRule="auto"/>
+      </w:pPr>
+      <w:r>
+        <w:continuationSeparator/>
+      </w:r>
+    </w:p>
+  </w:footnote>
+</w:footnotes>
+</file>
+
+<file path=word/header1.xml><?xml version="1.0" encoding="utf-8"?>
+<w:hdr xmlns:wpc="http://schemas.microsoft.com/office/word/2010/wordprocessingCanvas" xmlns:cx="http://schemas.microsoft.com/office/drawing/2014/chartex" xmlns:cx1="http://schemas.microsoft.com/office/drawing/2015/9/8/chartex" xmlns:cx2="http://schemas.microsoft.com/office/drawing/2015/10/21/chartex" xmlns:cx3="http://schemas.microsoft.com/office/drawing/2016/5/9/chartex" xmlns:cx4="http://schemas.microsoft.com/office/drawing/2016/5/10/chartex" xmlns:cx5="http://schemas.microsoft.com/office/drawing/2016/5/11/chartex" xmlns:cx6="http://schemas.microsoft.com/office/drawing/2016/5/12/chartex" xmlns:cx7="http://schemas.microsoft.com/office/drawing/2016/5/13/chartex" xmlns:cx8="http://schemas.microsoft.com/office/drawing/2016/5/14/chartex" xmlns:mc="http://schemas.openxmlformats.org/markup-compatibility/2006" xmlns:aink="http://schemas.microsoft.com/office/drawing/2016/ink" xmlns:am3d="http://schemas.microsoft.com/office/drawing/2017/model3d" xmlns:o="urn:schemas-microsoft-com:office:office" xmlns:r="http://schemas.openxmlformats.org/officeDocument/2006/relationships" xmlns:m="http://schemas.openxmlformats.org/officeDocument/2006/math" xmlns:v="urn:schemas-microsoft-com:vml" xmlns:wp14="http://schemas.microsoft.com/office/word/2010/wordprocessingDrawing" xmlns:wp="http://schemas.openxmlformats.org/drawingml/2006/wordprocessingDrawing" xmlns:w10="urn:schemas-microsoft-com:office:word" xmlns:w="http://schemas.openxmlformats.org/wordprocessingml/2006/main" xmlns:w14="http://schemas.microsoft.com/office/word/2010/wordml" xmlns:w15="http://schemas.microsoft.com/office/word/2012/wordml" xmlns:w16cid="http://schemas.microsoft.com/office/word/2016/wordml/cid" xmlns:w16se="http://schemas.microsoft.com/office/word/2015/wordml/symex" xmlns:wpg="http://schemas.microsoft.com/office/word/2010/wordprocessingGroup" xmlns:wpi="http://schemas.microsoft.com/office/word/2010/wordprocessingInk" xmlns:wne="http://schemas.microsoft.com/office/word/2006/wordml" xmlns:wps="http://schemas.microsoft.com/office/word/2010/wordprocessingShape" mc:Ignorable="w14 w15 w16se w16cid wp14">
+  <w:p>
+    <w:pPr>
+      <w:pStyle w:val="Header"/>
+      <w:jc w:val="center"/>
+      <w:rPr>
+        <w:rFonts w:ascii="Times New Roman" w:hAnsi="Times New Roman" w:cs="Times New Roman"/>
+        <w:lang w:val="en-US"/>
+      </w:rPr>
+    </w:pPr>
+    <w:r>
+      <w:rPr>
+        <w:noProof/>
+      </w:rPr>
+      <w:drawing>
+        <wp:anchor distT="0" distB="0" distL="114300" distR="114300" simplePos="0" relativeHeight="251660288" behindDoc="0" locked="0" layoutInCell="1" allowOverlap="1" wp14:anchorId="284BBE85" wp14:editId="7CD8ACBC">
+          <wp:simplePos x="0" y="0"/>
+          <wp:positionH relativeFrom="column">
+            <wp:posOffset>4660332</wp:posOffset>
+          </wp:positionH>
+          <wp:positionV relativeFrom="paragraph">
+            <wp:posOffset>-328295</wp:posOffset>
+          </wp:positionV>
+          <wp:extent cx="1828318" cy="1203253"/>
+          <wp:effectExtent l="0" t="0" r="635" b="0"/>
+          <wp:wrapNone/>
+          <wp:docPr id="647381210" name="Picture 2"/>
+          <wp:cNvGraphicFramePr>
+            <a:graphicFrameLocks xmlns:a="http://schemas.openxmlformats.org/drawingml/2006/main" noChangeAspect="1"/>
+          </wp:cNvGraphicFramePr>
+          <a:graphic xmlns:a="http://schemas.openxmlformats.org/drawingml/2006/main">
+            <a:graphicData uri="http://schemas.openxmlformats.org/drawingml/2006/picture">
+              <pic:pic xmlns:pic="http://schemas.openxmlformats.org/drawingml/2006/picture">
+                <pic:nvPicPr>
+                  <pic:cNvPr id="0" name="Picture 3"/>
+                  <pic:cNvPicPr>
+                    <a:picLocks noChangeAspect="1" noChangeArrowheads="1"/>
+                  </pic:cNvPicPr>
+                </pic:nvPicPr>
+                <pic:blipFill>
+                  <a:blip r:embed="rId1">
+                    <a:extLst>
+                      <a:ext uri="{28A0092B-C50C-407E-A947-70E740481C1C}">
+                        <a14:useLocalDpi xmlns:a14="http://schemas.microsoft.com/office/drawing/2010/main" val="0"/>
+                      </a:ext>
+                    </a:extLst>
+                  </a:blip>
+                  <a:srcRect/>
+                  <a:stretch>
+                    <a:fillRect/>
+                  </a:stretch>
+                </pic:blipFill>
+                <pic:spPr bwMode="auto">
+                  <a:xfrm>
+                    <a:off x="0" y="0"/>
+                    <a:ext cx="1828318" cy="1203253"/>
+                  </a:xfrm>
+                  <a:prstGeom prst="rect">
+                    <a:avLst/>
+                  </a:prstGeom>
+                  <a:noFill/>
+                  <a:ln>
+                    <a:noFill/>
+                  </a:ln>
+                </pic:spPr>
+              </pic:pic>
+            </a:graphicData>
+          </a:graphic>
+          <wp14:sizeRelH relativeFrom="margin">
+            <wp14:pctWidth>0</wp14:pctWidth>
+          </wp14:sizeRelH>
+          <wp14:sizeRelV relativeFrom="margin">
+            <wp14:pctHeight>0</wp14:pctHeight>
+          </wp14:sizeRelV>
+        </wp:anchor>
+      </w:drawing>
+    </w:r>
+    <w:r>
+      <w:rPr>
+        <w:noProof/>
+      </w:rPr>
+      <w:drawing>
+        <wp:anchor distT="0" distB="0" distL="114300" distR="114300" simplePos="0" relativeHeight="251659264" behindDoc="0" locked="0" layoutInCell="1" allowOverlap="1" wp14:anchorId="1F679FE2" wp14:editId="656D770B">
+          <wp:simplePos x="0" y="0"/>
+          <wp:positionH relativeFrom="column">
+            <wp:posOffset>11016</wp:posOffset>
+          </wp:positionH>
+          <wp:positionV relativeFrom="paragraph">
+            <wp:posOffset>-75007</wp:posOffset>
+          </wp:positionV>
+          <wp:extent cx="770829" cy="770829"/>
+          <wp:effectExtent l="0" t="0" r="0" b="0"/>
+          <wp:wrapNone/>
+          <wp:docPr id="980008775" name="Picture 1"/>
+          <wp:cNvGraphicFramePr>
+            <a:graphicFrameLocks xmlns:a="http://schemas.openxmlformats.org/drawingml/2006/main" noChangeAspect="1"/>
+          </wp:cNvGraphicFramePr>
+          <a:graphic xmlns:a="http://schemas.openxmlformats.org/drawingml/2006/main">
+            <a:graphicData uri="http://schemas.openxmlformats.org/drawingml/2006/picture">
+              <pic:pic xmlns:pic="http://schemas.openxmlformats.org/drawingml/2006/picture">
+                <pic:nvPicPr>
+                  <pic:cNvPr id="0" name="Picture 1"/>
+                  <pic:cNvPicPr>
+                    <a:picLocks noChangeAspect="1" noChangeArrowheads="1"/>
+                  </pic:cNvPicPr>
+                </pic:nvPicPr>
+                <pic:blipFill>
+                  <a:blip r:embed="rId2">
+                    <a:extLst>
+                      <a:ext uri="{28A0092B-C50C-407E-A947-70E740481C1C}">
+                        <a14:useLocalDpi xmlns:a14="http://schemas.microsoft.com/office/drawing/2010/main" val="0"/>
+                      </a:ext>
+                    </a:extLst>
+                  </a:blip>
+                  <a:srcRect/>
+                  <a:stretch>
+                    <a:fillRect/>
+                  </a:stretch>
+                </pic:blipFill>
+                <pic:spPr bwMode="auto">
+                  <a:xfrm>
+                    <a:off x="0" y="0"/>
+                    <a:ext cx="771728" cy="771728"/>
+                  </a:xfrm>
+                  <a:prstGeom prst="rect">
+                    <a:avLst/>
+                  </a:prstGeom>
+                  <a:noFill/>
+                  <a:ln>
+                    <a:noFill/>
+                  </a:ln>
+                </pic:spPr>
+              </pic:pic>
+            </a:graphicData>
+          </a:graphic>
+          <wp14:sizeRelH relativeFrom="margin">
+            <wp14:pctWidth>0</wp14:pctWidth>
+          </wp14:sizeRelH>
+          <wp14:sizeRelV relativeFrom="margin">
+            <wp14:pctHeight>0</wp14:pctHeight>
+          </wp14:sizeRelV>
+        </wp:anchor>
+      </w:drawing>
+    </w:r>
+    <w:r>
+      <w:rPr>
+        <w:rFonts w:ascii="Times New Roman" w:hAnsi="Times New Roman" w:cs="Times New Roman"/>
+        <w:lang w:val="en-US"/>
+      </w:rPr>
+      <w:t>Republic of the Philippines</w:t>
+    </w:r>
+  </w:p>
+  <w:p>
+    <w:pPr>
+      <w:pStyle w:val="Header"/>
+      <w:jc w:val="center"/>
+      <w:rPr>
+        <w:rFonts w:ascii="Times New Roman" w:hAnsi="Times New Roman" w:cs="Times New Roman"/>
+        <w:lang w:val="en-US"/>
+      </w:rPr>
+    </w:pPr>
+    <w:r>
+      <w:rPr>
+        <w:rFonts w:ascii="Times New Roman" w:hAnsi="Times New Roman" w:cs="Times New Roman"/>
+        <w:lang w:val="en-US"/>
+      </w:rPr>
+      <w:t>Province of Sorsogon</w:t>
+    </w:r>
+  </w:p>
+  <w:p>
+    <w:pPr>
+      <w:pStyle w:val="Header"/>
+      <w:jc w:val="center"/>
+      <w:rPr>
+        <w:rFonts w:ascii="Times New Roman" w:hAnsi="Times New Roman" w:cs="Times New Roman"/>
+        <w:lang w:val="en-US"/>
+      </w:rPr>
+    </w:pPr>
+    <w:r>
+      <w:rPr>
+        <w:rFonts w:ascii="Times New Roman" w:hAnsi="Times New Roman" w:cs="Times New Roman"/>
+        <w:lang w:val="en-US"/>
+      </w:rPr>
+      <w:t>Municipality of Juban</w:t>
+    </w:r>
+  </w:p>
+  <w:p>
+    <w:pPr>
+      <w:pStyle w:val="Header"/>
+      <w:jc w:val="center"/>
+      <w:rPr>
+        <w:rFonts w:ascii="Times New Roman" w:hAnsi="Times New Roman" w:cs="Times New Roman"/>
+        <w:lang w:val="en-US"/>
+      </w:rPr>
+    </w:pPr>
+  </w:p>
+  <w:p>
+    <w:pPr>
+      <w:pStyle w:val="Header"/>
+      <w:rPr>
+        <w:rFonts w:ascii="Times New Roman" w:hAnsi="Times New Roman" w:cs="Times New Roman"/>
+        <w:lang w:val="en-US"/>
+      </w:rPr>
+    </w:pPr>
+  </w:p>
+</w:hdr>
 </file>
 
 <file path=word/styles.xml><?xml version="1.0" encoding="utf-8"?>

</xml_diff>